<commit_message>
Revise submission doc: explain 'susu' for a global audience
Add a plain-English 'What is susu?' section (ROSCA / savings circle / tontine)
and make the elevator pitch + inspiration self-contained for non-West-African judges.
</commit_message>
<xml_diff>
--- a/SUBMISSION-DEVPOST.docx
+++ b/SUBMISSION-DEVPOST.docx
@@ -74,12 +74,12 @@
           <w:color w:val="666666"/>
           <w:sz w:val="18"/>
         </w:rPr>
-        <w:t>Max 200 characters (short tagline). Current length: 195.</w:t>
+        <w:t>Max 200 characters (short tagline). Current length: 198.</w:t>
       </w:r>
     </w:p>
     <w:p>
       <w:r>
-        <w:t>Run your whole SusuMate savings group by chatting on WhatsApp. Mate is a Qwen-powered agent that acts on the real SusuMate API for you — join groups, contribute, and send money, all in a message.</w:t>
+        <w:t>Run a group savings circle (a West African “susu”) entirely by chatting on WhatsApp. Mate is a Qwen-powered AI agent that joins groups, contributes, and sends money on the real SusuMate API for you.</w:t>
       </w:r>
     </w:p>
     <w:p>
@@ -110,6 +110,26 @@
         <w:rPr>
           <w:color w:val="126B50"/>
         </w:rPr>
+        <w:t>First, what is “susu”?</w:t>
+      </w:r>
+    </w:p>
+    <w:p>
+      <w:r>
+        <w:rPr>
+          <w:b w:val="0"/>
+          <w:i w:val="0"/>
+        </w:rPr>
+        <w:t>Susu is a centuries-old way of saving money together, common across Ghana and West Africa. Around the world the same idea is called a ROSCA (Rotating Savings and Credit Association), a tontine, a “merry-go-round”, or a savings circle. It works like this: a group of people who trust each other each contribute a fixed amount on a regular schedule (say ₵100 every week). Each round, one member receives the entire pooled pot; the next round it’s someone else’s turn, until everyone has been paid once. It gives people a lump sum they could not easily save alone — no bank account, no loan, no interest. Hundreds of millions of people worldwide save this way. SusuMate is a Ghanaian fintech app that makes running one safe and automatic (mobile-money contributions, fair payout rotation, public fundraising campaigns, and money transfers).</w:t>
+      </w:r>
+    </w:p>
+    <w:p>
+      <w:pPr>
+        <w:pStyle w:val="Heading2"/>
+      </w:pPr>
+      <w:r>
+        <w:rPr>
+          <w:color w:val="126B50"/>
+        </w:rPr>
         <w:t>Inspiration</w:t>
       </w:r>
     </w:p>
@@ -119,7 +139,7 @@
           <w:b w:val="0"/>
           <w:i w:val="0"/>
         </w:rPr>
-        <w:t>Susu — rotating savings with people you trust — is how millions of Ghanaians save. But group admins juggle spreadsheets, chase contributions, and manually track whose turn it is to be paid. SusuMate already turns that into a clean app, yet the place these groups actually live is WhatsApp. We wanted to remove the last bit of friction: let people do everything — start a group, contribute by mobile money, vote on payouts, send money — without ever leaving the chat they’re already in. An AI agent on WhatsApp, powered by Qwen, meets users exactly where they are.</w:t>
+        <w:t>These savings groups are built on trust, and the trust lives in a group chat — almost always on WhatsApp. Today an organizer still juggles spreadsheets, chases contributions, and manually tracks whose turn it is to be paid. SusuMate turns that into a clean app, but asking every member to download an app, sign up, and learn new screens is friction — especially for less tech-savvy or first-time smartphone users. We wanted to remove that last barrier: let people do everything — start a group, contribute by mobile money, vote on payouts, send money — without ever leaving the WhatsApp chat they already use every day. An AI agent on WhatsApp, powered by Qwen, meets users exactly where they are, in plain language.</w:t>
       </w:r>
     </w:p>
     <w:p>

</xml_diff>

<commit_message>
Remove backend framework references and embedded-agent framing
- Diagram + docs now say only 'SusuMate API (private backend)' — no Laravel/PHP/Sanctum.
- Reframe the guide around what THIS agent does (no 'ported from an embedded agent').
- Genericize source comments; drop internal server paths; update Built-with tags.
</commit_message>
<xml_diff>
--- a/SUBMISSION-DEVPOST.docx
+++ b/SUBMISSION-DEVPOST.docx
@@ -319,10 +319,10 @@
         <w:rPr>
           <w:b/>
         </w:rPr>
-        <w:t xml:space="preserve">From embedded to standalone: </w:t>
+        <w:t xml:space="preserve">Acting as the user: </w:t>
       </w:r>
       <w:r>
-        <w:t>The existing in-app agent ran actions in-process; we re-architected it to call the public API over HTTP as the user, without duplicating any permission logic.</w:t>
+        <w:t>Mapping ~40 SusuMate actions into reliable tool calls, and making the agent act strictly as the signed-in user over HTTP — so no permission logic is duplicated and nothing can be done that the user couldn’t do themselves.</w:t>
       </w:r>
     </w:p>
     <w:p>
@@ -514,7 +514,7 @@
           <w:b w:val="0"/>
           <w:i w:val="0"/>
         </w:rPr>
-        <w:t>node.js, typescript, qwen, qwen-plus, alibaba-cloud, dashscope, openai-sdk, baileys, whatsapp, laravel, php, rest-api, laravel-sanctum, aes-256-gcm, tsx</w:t>
+        <w:t>node.js, typescript, qwen, qwen-plus, alibaba-cloud, dashscope, openai-sdk, baileys, whatsapp, rest-api, oauth, aes-256-gcm, tsx, fintech, mobile-money</w:t>
       </w:r>
     </w:p>
     <w:p>

</xml_diff>